<commit_message>
Add surds question and embedded diagrams; export paper as PDF
- New Q2 (4 marks): rationalising surd denominators, bringing the paper
  to 90 marks across 14 questions.
- Replaced the three placeholder captions with drawn figures: the plaque
  diagram, the sketch axes for the trig graph question, and a 2 mm grid
  for the linear law question.
- Renumbered questions 1-14, split the examiner grid into two columns so
  the cover fits one page, and removed redundant trailing gaps that
  produced blank pages.
- Added the PDF export alongside the DOCX.

Co-Authored-By: Claude Opus 5 <noreply@anthropic.com>
Claude-Session: https://claude.ai/code/session_01F7ETHVetjPb8yks4PaCygS
</commit_message>
<xml_diff>
--- a/Sec3_EOY_AMath_Paper.docx
+++ b/Sec3_EOY_AMath_Paper.docx
@@ -11,7 +11,7 @@
         <w:rPr>
           <w:b/>
           <w:i w:val="0"/>
-          <w:sz w:val="32"/>
+          <w:sz w:val="30"/>
         </w:rPr>
         <w:t>SECONDARY 3 EXPRESS</w:t>
       </w:r>
@@ -25,7 +25,7 @@
         <w:rPr>
           <w:b/>
           <w:i w:val="0"/>
-          <w:sz w:val="32"/>
+          <w:sz w:val="30"/>
         </w:rPr>
         <w:t>END-OF-YEAR EXAMINATION</w:t>
       </w:r>
@@ -65,11 +65,6 @@
     </w:p>
     <w:p>
       <w:pPr>
-        <w:spacing w:after="0"/>
-      </w:pPr>
-    </w:p>
-    <w:p>
-      <w:pPr>
         <w:tabs>
           <w:tab w:pos="9071" w:val="right"/>
         </w:tabs>
@@ -134,11 +129,6 @@
       <w:pPr>
         <w:spacing w:after="0"/>
       </w:pPr>
-    </w:p>
-    <w:p>
-      <w:pPr>
-        <w:spacing w:after="0"/>
-      </w:pPr>
       <w:r>
         <w:rPr>
           <w:b/>
@@ -152,11 +142,6 @@
       <w:pPr>
         <w:spacing w:after="0"/>
       </w:pPr>
-    </w:p>
-    <w:p>
-      <w:pPr>
-        <w:spacing w:after="0"/>
-      </w:pPr>
       <w:r>
         <w:rPr>
           <w:b w:val="0"/>
@@ -272,7 +257,7 @@
           <w:i w:val="0"/>
           <w:sz w:val="24"/>
         </w:rPr>
-        <w:t>The total of the marks for this paper is 86.</w:t>
+        <w:t>The total of the marks for this paper is 90.</w:t>
       </w:r>
     </w:p>
     <w:p>
@@ -337,15 +322,18 @@
         <w:tblLook w:firstColumn="1" w:firstRow="1" w:lastColumn="0" w:lastRow="0" w:noHBand="0" w:noVBand="1" w:val="04A0"/>
       </w:tblPr>
       <w:tblGrid>
-        <w:gridCol w:w="3249"/>
-        <w:gridCol w:w="3249"/>
-        <w:gridCol w:w="3249"/>
+        <w:gridCol w:w="1624"/>
+        <w:gridCol w:w="1624"/>
+        <w:gridCol w:w="1624"/>
+        <w:gridCol w:w="1624"/>
+        <w:gridCol w:w="1624"/>
+        <w:gridCol w:w="1624"/>
       </w:tblGrid>
       <w:tr>
         <w:tc>
           <w:tcPr>
-            <w:tcW w:type="dxa" w:w="1701"/>
-            <w:gridSpan w:val="3"/>
+            <w:tcW w:type="dxa" w:w="1361"/>
+            <w:gridSpan w:val="6"/>
           </w:tcPr>
           <w:p>
             <w:pPr>
@@ -363,15 +351,17 @@
       <w:tr>
         <w:tc>
           <w:tcPr>
-            <w:tcW w:type="dxa" w:w="1247"/>
+            <w:tcW w:type="dxa" w:w="1134"/>
           </w:tcPr>
           <w:p>
             <w:pPr>
+              <w:spacing w:after="0"/>
               <w:jc w:val="center"/>
             </w:pPr>
             <w:r>
               <w:rPr>
                 <w:b/>
+                <w:sz w:val="20"/>
               </w:rPr>
               <w:t>Q1</w:t>
             </w:r>
@@ -379,38 +369,107 @@
         </w:tc>
         <w:tc>
           <w:tcPr>
-            <w:tcW w:type="dxa" w:w="1247"/>
+            <w:tcW w:type="dxa" w:w="1020"/>
           </w:tcPr>
           <w:p>
             <w:pPr>
+              <w:spacing w:after="0"/>
               <w:jc w:val="center"/>
             </w:pPr>
             <w:r>
+              <w:rPr>
+                <w:b w:val="0"/>
+                <w:sz w:val="20"/>
+              </w:rPr>
               <w:t>3</w:t>
             </w:r>
           </w:p>
         </w:tc>
         <w:tc>
           <w:tcPr>
-            <w:tcW w:type="dxa" w:w="1701"/>
+            <w:tcW w:type="dxa" w:w="1361"/>
           </w:tcPr>
           <w:p>
-            <w:r/>
+            <w:pPr>
+              <w:spacing w:after="0"/>
+              <w:jc w:val="center"/>
+            </w:pPr>
+            <w:r>
+              <w:rPr>
+                <w:b w:val="0"/>
+                <w:sz w:val="20"/>
+              </w:rPr>
+            </w:r>
+          </w:p>
+        </w:tc>
+        <w:tc>
+          <w:tcPr>
+            <w:tcW w:type="dxa" w:w="1134"/>
+          </w:tcPr>
+          <w:p>
+            <w:pPr>
+              <w:spacing w:after="0"/>
+              <w:jc w:val="center"/>
+            </w:pPr>
+            <w:r>
+              <w:rPr>
+                <w:b/>
+                <w:sz w:val="20"/>
+              </w:rPr>
+              <w:t>Q8</w:t>
+            </w:r>
+          </w:p>
+        </w:tc>
+        <w:tc>
+          <w:tcPr>
+            <w:tcW w:type="dxa" w:w="1020"/>
+          </w:tcPr>
+          <w:p>
+            <w:pPr>
+              <w:spacing w:after="0"/>
+              <w:jc w:val="center"/>
+            </w:pPr>
+            <w:r>
+              <w:rPr>
+                <w:b w:val="0"/>
+                <w:sz w:val="20"/>
+              </w:rPr>
+              <w:t>7</w:t>
+            </w:r>
+          </w:p>
+        </w:tc>
+        <w:tc>
+          <w:tcPr>
+            <w:tcW w:type="dxa" w:w="1361"/>
+          </w:tcPr>
+          <w:p>
+            <w:pPr>
+              <w:spacing w:after="0"/>
+              <w:jc w:val="center"/>
+            </w:pPr>
+            <w:r>
+              <w:rPr>
+                <w:b w:val="0"/>
+                <w:sz w:val="20"/>
+              </w:rPr>
+            </w:r>
           </w:p>
         </w:tc>
       </w:tr>
       <w:tr>
         <w:tc>
           <w:tcPr>
-            <w:tcW w:type="dxa" w:w="1247"/>
+            <w:tcW w:type="dxa" w:w="1134"/>
           </w:tcPr>
           <w:p>
             <w:pPr>
+              <w:spacing w:after="0"/>
               <w:jc w:val="center"/>
             </w:pPr>
             <w:r>
               <w:rPr>
                 <w:b/>
+                <w:sz w:val="20"/>
               </w:rPr>
               <w:t>Q2</w:t>
             </w:r>
@@ -418,38 +477,107 @@
         </w:tc>
         <w:tc>
           <w:tcPr>
-            <w:tcW w:type="dxa" w:w="1247"/>
+            <w:tcW w:type="dxa" w:w="1020"/>
           </w:tcPr>
           <w:p>
             <w:pPr>
+              <w:spacing w:after="0"/>
               <w:jc w:val="center"/>
             </w:pPr>
             <w:r>
+              <w:rPr>
+                <w:b w:val="0"/>
+                <w:sz w:val="20"/>
+              </w:rPr>
               <w:t>4</w:t>
             </w:r>
           </w:p>
         </w:tc>
         <w:tc>
           <w:tcPr>
-            <w:tcW w:type="dxa" w:w="1701"/>
+            <w:tcW w:type="dxa" w:w="1361"/>
           </w:tcPr>
           <w:p>
-            <w:r/>
+            <w:pPr>
+              <w:spacing w:after="0"/>
+              <w:jc w:val="center"/>
+            </w:pPr>
+            <w:r>
+              <w:rPr>
+                <w:b w:val="0"/>
+                <w:sz w:val="20"/>
+              </w:rPr>
+            </w:r>
+          </w:p>
+        </w:tc>
+        <w:tc>
+          <w:tcPr>
+            <w:tcW w:type="dxa" w:w="1134"/>
+          </w:tcPr>
+          <w:p>
+            <w:pPr>
+              <w:spacing w:after="0"/>
+              <w:jc w:val="center"/>
+            </w:pPr>
+            <w:r>
+              <w:rPr>
+                <w:b/>
+                <w:sz w:val="20"/>
+              </w:rPr>
+              <w:t>Q9</w:t>
+            </w:r>
+          </w:p>
+        </w:tc>
+        <w:tc>
+          <w:tcPr>
+            <w:tcW w:type="dxa" w:w="1020"/>
+          </w:tcPr>
+          <w:p>
+            <w:pPr>
+              <w:spacing w:after="0"/>
+              <w:jc w:val="center"/>
+            </w:pPr>
+            <w:r>
+              <w:rPr>
+                <w:b w:val="0"/>
+                <w:sz w:val="20"/>
+              </w:rPr>
+              <w:t>7</w:t>
+            </w:r>
+          </w:p>
+        </w:tc>
+        <w:tc>
+          <w:tcPr>
+            <w:tcW w:type="dxa" w:w="1361"/>
+          </w:tcPr>
+          <w:p>
+            <w:pPr>
+              <w:spacing w:after="0"/>
+              <w:jc w:val="center"/>
+            </w:pPr>
+            <w:r>
+              <w:rPr>
+                <w:b w:val="0"/>
+                <w:sz w:val="20"/>
+              </w:rPr>
+            </w:r>
           </w:p>
         </w:tc>
       </w:tr>
       <w:tr>
         <w:tc>
           <w:tcPr>
-            <w:tcW w:type="dxa" w:w="1247"/>
+            <w:tcW w:type="dxa" w:w="1134"/>
           </w:tcPr>
           <w:p>
             <w:pPr>
+              <w:spacing w:after="0"/>
               <w:jc w:val="center"/>
             </w:pPr>
             <w:r>
               <w:rPr>
                 <w:b/>
+                <w:sz w:val="20"/>
               </w:rPr>
               <w:t>Q3</w:t>
             </w:r>
@@ -457,38 +585,107 @@
         </w:tc>
         <w:tc>
           <w:tcPr>
-            <w:tcW w:type="dxa" w:w="1247"/>
+            <w:tcW w:type="dxa" w:w="1020"/>
           </w:tcPr>
           <w:p>
             <w:pPr>
+              <w:spacing w:after="0"/>
               <w:jc w:val="center"/>
             </w:pPr>
             <w:r>
+              <w:rPr>
+                <w:b w:val="0"/>
+                <w:sz w:val="20"/>
+              </w:rPr>
               <w:t>4</w:t>
             </w:r>
           </w:p>
         </w:tc>
         <w:tc>
           <w:tcPr>
-            <w:tcW w:type="dxa" w:w="1701"/>
+            <w:tcW w:type="dxa" w:w="1361"/>
           </w:tcPr>
           <w:p>
-            <w:r/>
+            <w:pPr>
+              <w:spacing w:after="0"/>
+              <w:jc w:val="center"/>
+            </w:pPr>
+            <w:r>
+              <w:rPr>
+                <w:b w:val="0"/>
+                <w:sz w:val="20"/>
+              </w:rPr>
+            </w:r>
+          </w:p>
+        </w:tc>
+        <w:tc>
+          <w:tcPr>
+            <w:tcW w:type="dxa" w:w="1134"/>
+          </w:tcPr>
+          <w:p>
+            <w:pPr>
+              <w:spacing w:after="0"/>
+              <w:jc w:val="center"/>
+            </w:pPr>
+            <w:r>
+              <w:rPr>
+                <w:b/>
+                <w:sz w:val="20"/>
+              </w:rPr>
+              <w:t>Q10</w:t>
+            </w:r>
+          </w:p>
+        </w:tc>
+        <w:tc>
+          <w:tcPr>
+            <w:tcW w:type="dxa" w:w="1020"/>
+          </w:tcPr>
+          <w:p>
+            <w:pPr>
+              <w:spacing w:after="0"/>
+              <w:jc w:val="center"/>
+            </w:pPr>
+            <w:r>
+              <w:rPr>
+                <w:b w:val="0"/>
+                <w:sz w:val="20"/>
+              </w:rPr>
+              <w:t>7</w:t>
+            </w:r>
+          </w:p>
+        </w:tc>
+        <w:tc>
+          <w:tcPr>
+            <w:tcW w:type="dxa" w:w="1361"/>
+          </w:tcPr>
+          <w:p>
+            <w:pPr>
+              <w:spacing w:after="0"/>
+              <w:jc w:val="center"/>
+            </w:pPr>
+            <w:r>
+              <w:rPr>
+                <w:b w:val="0"/>
+                <w:sz w:val="20"/>
+              </w:rPr>
+            </w:r>
           </w:p>
         </w:tc>
       </w:tr>
       <w:tr>
         <w:tc>
           <w:tcPr>
-            <w:tcW w:type="dxa" w:w="1247"/>
+            <w:tcW w:type="dxa" w:w="1134"/>
           </w:tcPr>
           <w:p>
             <w:pPr>
+              <w:spacing w:after="0"/>
               <w:jc w:val="center"/>
             </w:pPr>
             <w:r>
               <w:rPr>
                 <w:b/>
+                <w:sz w:val="20"/>
               </w:rPr>
               <w:t>Q4</w:t>
             </w:r>
@@ -496,38 +693,107 @@
         </w:tc>
         <w:tc>
           <w:tcPr>
-            <w:tcW w:type="dxa" w:w="1247"/>
+            <w:tcW w:type="dxa" w:w="1020"/>
           </w:tcPr>
           <w:p>
             <w:pPr>
+              <w:spacing w:after="0"/>
               <w:jc w:val="center"/>
             </w:pPr>
             <w:r>
+              <w:rPr>
+                <w:b w:val="0"/>
+                <w:sz w:val="20"/>
+              </w:rPr>
               <w:t>4</w:t>
             </w:r>
           </w:p>
         </w:tc>
         <w:tc>
           <w:tcPr>
-            <w:tcW w:type="dxa" w:w="1701"/>
+            <w:tcW w:type="dxa" w:w="1361"/>
           </w:tcPr>
           <w:p>
-            <w:r/>
+            <w:pPr>
+              <w:spacing w:after="0"/>
+              <w:jc w:val="center"/>
+            </w:pPr>
+            <w:r>
+              <w:rPr>
+                <w:b w:val="0"/>
+                <w:sz w:val="20"/>
+              </w:rPr>
+            </w:r>
+          </w:p>
+        </w:tc>
+        <w:tc>
+          <w:tcPr>
+            <w:tcW w:type="dxa" w:w="1134"/>
+          </w:tcPr>
+          <w:p>
+            <w:pPr>
+              <w:spacing w:after="0"/>
+              <w:jc w:val="center"/>
+            </w:pPr>
+            <w:r>
+              <w:rPr>
+                <w:b/>
+                <w:sz w:val="20"/>
+              </w:rPr>
+              <w:t>Q11</w:t>
+            </w:r>
+          </w:p>
+        </w:tc>
+        <w:tc>
+          <w:tcPr>
+            <w:tcW w:type="dxa" w:w="1020"/>
+          </w:tcPr>
+          <w:p>
+            <w:pPr>
+              <w:spacing w:after="0"/>
+              <w:jc w:val="center"/>
+            </w:pPr>
+            <w:r>
+              <w:rPr>
+                <w:b w:val="0"/>
+                <w:sz w:val="20"/>
+              </w:rPr>
+              <w:t>8</w:t>
+            </w:r>
+          </w:p>
+        </w:tc>
+        <w:tc>
+          <w:tcPr>
+            <w:tcW w:type="dxa" w:w="1361"/>
+          </w:tcPr>
+          <w:p>
+            <w:pPr>
+              <w:spacing w:after="0"/>
+              <w:jc w:val="center"/>
+            </w:pPr>
+            <w:r>
+              <w:rPr>
+                <w:b w:val="0"/>
+                <w:sz w:val="20"/>
+              </w:rPr>
+            </w:r>
           </w:p>
         </w:tc>
       </w:tr>
       <w:tr>
         <w:tc>
           <w:tcPr>
-            <w:tcW w:type="dxa" w:w="1247"/>
+            <w:tcW w:type="dxa" w:w="1134"/>
           </w:tcPr>
           <w:p>
             <w:pPr>
+              <w:spacing w:after="0"/>
               <w:jc w:val="center"/>
             </w:pPr>
             <w:r>
               <w:rPr>
                 <w:b/>
+                <w:sz w:val="20"/>
               </w:rPr>
               <w:t>Q5</w:t>
             </w:r>
@@ -535,38 +801,107 @@
         </w:tc>
         <w:tc>
           <w:tcPr>
-            <w:tcW w:type="dxa" w:w="1247"/>
+            <w:tcW w:type="dxa" w:w="1020"/>
           </w:tcPr>
           <w:p>
             <w:pPr>
+              <w:spacing w:after="0"/>
               <w:jc w:val="center"/>
             </w:pPr>
             <w:r>
-              <w:t>5</w:t>
+              <w:rPr>
+                <w:b w:val="0"/>
+                <w:sz w:val="20"/>
+              </w:rPr>
+              <w:t>4</w:t>
             </w:r>
           </w:p>
         </w:tc>
         <w:tc>
           <w:tcPr>
-            <w:tcW w:type="dxa" w:w="1701"/>
+            <w:tcW w:type="dxa" w:w="1361"/>
           </w:tcPr>
           <w:p>
-            <w:r/>
+            <w:pPr>
+              <w:spacing w:after="0"/>
+              <w:jc w:val="center"/>
+            </w:pPr>
+            <w:r>
+              <w:rPr>
+                <w:b w:val="0"/>
+                <w:sz w:val="20"/>
+              </w:rPr>
+            </w:r>
+          </w:p>
+        </w:tc>
+        <w:tc>
+          <w:tcPr>
+            <w:tcW w:type="dxa" w:w="1134"/>
+          </w:tcPr>
+          <w:p>
+            <w:pPr>
+              <w:spacing w:after="0"/>
+              <w:jc w:val="center"/>
+            </w:pPr>
+            <w:r>
+              <w:rPr>
+                <w:b/>
+                <w:sz w:val="20"/>
+              </w:rPr>
+              <w:t>Q12</w:t>
+            </w:r>
+          </w:p>
+        </w:tc>
+        <w:tc>
+          <w:tcPr>
+            <w:tcW w:type="dxa" w:w="1020"/>
+          </w:tcPr>
+          <w:p>
+            <w:pPr>
+              <w:spacing w:after="0"/>
+              <w:jc w:val="center"/>
+            </w:pPr>
+            <w:r>
+              <w:rPr>
+                <w:b w:val="0"/>
+                <w:sz w:val="20"/>
+              </w:rPr>
+              <w:t>10</w:t>
+            </w:r>
+          </w:p>
+        </w:tc>
+        <w:tc>
+          <w:tcPr>
+            <w:tcW w:type="dxa" w:w="1361"/>
+          </w:tcPr>
+          <w:p>
+            <w:pPr>
+              <w:spacing w:after="0"/>
+              <w:jc w:val="center"/>
+            </w:pPr>
+            <w:r>
+              <w:rPr>
+                <w:b w:val="0"/>
+                <w:sz w:val="20"/>
+              </w:rPr>
+            </w:r>
           </w:p>
         </w:tc>
       </w:tr>
       <w:tr>
         <w:tc>
           <w:tcPr>
-            <w:tcW w:type="dxa" w:w="1247"/>
+            <w:tcW w:type="dxa" w:w="1134"/>
           </w:tcPr>
           <w:p>
             <w:pPr>
+              <w:spacing w:after="0"/>
               <w:jc w:val="center"/>
             </w:pPr>
             <w:r>
               <w:rPr>
                 <w:b/>
+                <w:sz w:val="20"/>
               </w:rPr>
               <w:t>Q6</w:t>
             </w:r>
@@ -574,38 +909,107 @@
         </w:tc>
         <w:tc>
           <w:tcPr>
-            <w:tcW w:type="dxa" w:w="1247"/>
+            <w:tcW w:type="dxa" w:w="1020"/>
           </w:tcPr>
           <w:p>
             <w:pPr>
+              <w:spacing w:after="0"/>
               <w:jc w:val="center"/>
             </w:pPr>
             <w:r>
+              <w:rPr>
+                <w:b w:val="0"/>
+                <w:sz w:val="20"/>
+              </w:rPr>
               <w:t>5</w:t>
             </w:r>
           </w:p>
         </w:tc>
         <w:tc>
           <w:tcPr>
-            <w:tcW w:type="dxa" w:w="1701"/>
+            <w:tcW w:type="dxa" w:w="1361"/>
           </w:tcPr>
           <w:p>
-            <w:r/>
+            <w:pPr>
+              <w:spacing w:after="0"/>
+              <w:jc w:val="center"/>
+            </w:pPr>
+            <w:r>
+              <w:rPr>
+                <w:b w:val="0"/>
+                <w:sz w:val="20"/>
+              </w:rPr>
+            </w:r>
+          </w:p>
+        </w:tc>
+        <w:tc>
+          <w:tcPr>
+            <w:tcW w:type="dxa" w:w="1134"/>
+          </w:tcPr>
+          <w:p>
+            <w:pPr>
+              <w:spacing w:after="0"/>
+              <w:jc w:val="center"/>
+            </w:pPr>
+            <w:r>
+              <w:rPr>
+                <w:b/>
+                <w:sz w:val="20"/>
+              </w:rPr>
+              <w:t>Q13</w:t>
+            </w:r>
+          </w:p>
+        </w:tc>
+        <w:tc>
+          <w:tcPr>
+            <w:tcW w:type="dxa" w:w="1020"/>
+          </w:tcPr>
+          <w:p>
+            <w:pPr>
+              <w:spacing w:after="0"/>
+              <w:jc w:val="center"/>
+            </w:pPr>
+            <w:r>
+              <w:rPr>
+                <w:b w:val="0"/>
+                <w:sz w:val="20"/>
+              </w:rPr>
+              <w:t>10</w:t>
+            </w:r>
+          </w:p>
+        </w:tc>
+        <w:tc>
+          <w:tcPr>
+            <w:tcW w:type="dxa" w:w="1361"/>
+          </w:tcPr>
+          <w:p>
+            <w:pPr>
+              <w:spacing w:after="0"/>
+              <w:jc w:val="center"/>
+            </w:pPr>
+            <w:r>
+              <w:rPr>
+                <w:b w:val="0"/>
+                <w:sz w:val="20"/>
+              </w:rPr>
+            </w:r>
           </w:p>
         </w:tc>
       </w:tr>
       <w:tr>
         <w:tc>
           <w:tcPr>
-            <w:tcW w:type="dxa" w:w="1247"/>
+            <w:tcW w:type="dxa" w:w="1134"/>
           </w:tcPr>
           <w:p>
             <w:pPr>
+              <w:spacing w:after="0"/>
               <w:jc w:val="center"/>
             </w:pPr>
             <w:r>
               <w:rPr>
                 <w:b/>
+                <w:sz w:val="20"/>
               </w:rPr>
               <w:t>Q7</w:t>
             </w:r>
@@ -613,272 +1017,158 @@
         </w:tc>
         <w:tc>
           <w:tcPr>
-            <w:tcW w:type="dxa" w:w="1247"/>
+            <w:tcW w:type="dxa" w:w="1020"/>
           </w:tcPr>
           <w:p>
             <w:pPr>
+              <w:spacing w:after="0"/>
               <w:jc w:val="center"/>
             </w:pPr>
             <w:r>
-              <w:t>7</w:t>
+              <w:rPr>
+                <w:b w:val="0"/>
+                <w:sz w:val="20"/>
+              </w:rPr>
+              <w:t>5</w:t>
             </w:r>
           </w:p>
         </w:tc>
         <w:tc>
           <w:tcPr>
-            <w:tcW w:type="dxa" w:w="1701"/>
+            <w:tcW w:type="dxa" w:w="1361"/>
           </w:tcPr>
           <w:p>
-            <w:r/>
+            <w:pPr>
+              <w:spacing w:after="0"/>
+              <w:jc w:val="center"/>
+            </w:pPr>
+            <w:r>
+              <w:rPr>
+                <w:b w:val="0"/>
+                <w:sz w:val="20"/>
+              </w:rPr>
+            </w:r>
+          </w:p>
+        </w:tc>
+        <w:tc>
+          <w:tcPr>
+            <w:tcW w:type="dxa" w:w="1134"/>
+          </w:tcPr>
+          <w:p>
+            <w:pPr>
+              <w:spacing w:after="0"/>
+              <w:jc w:val="center"/>
+            </w:pPr>
+            <w:r>
+              <w:rPr>
+                <w:b/>
+                <w:sz w:val="20"/>
+              </w:rPr>
+              <w:t>Q14</w:t>
+            </w:r>
+          </w:p>
+        </w:tc>
+        <w:tc>
+          <w:tcPr>
+            <w:tcW w:type="dxa" w:w="1020"/>
+          </w:tcPr>
+          <w:p>
+            <w:pPr>
+              <w:spacing w:after="0"/>
+              <w:jc w:val="center"/>
+            </w:pPr>
+            <w:r>
+              <w:rPr>
+                <w:b w:val="0"/>
+                <w:sz w:val="20"/>
+              </w:rPr>
+              <w:t>12</w:t>
+            </w:r>
+          </w:p>
+        </w:tc>
+        <w:tc>
+          <w:tcPr>
+            <w:tcW w:type="dxa" w:w="1361"/>
+          </w:tcPr>
+          <w:p>
+            <w:pPr>
+              <w:spacing w:after="0"/>
+              <w:jc w:val="center"/>
+            </w:pPr>
+            <w:r>
+              <w:rPr>
+                <w:b w:val="0"/>
+                <w:sz w:val="20"/>
+              </w:rPr>
+            </w:r>
           </w:p>
         </w:tc>
       </w:tr>
       <w:tr>
         <w:tc>
           <w:tcPr>
-            <w:tcW w:type="dxa" w:w="1247"/>
+            <w:tcW w:type="dxa" w:w="1134"/>
           </w:tcPr>
           <w:p>
             <w:pPr>
+              <w:spacing w:after="0"/>
+              <w:jc w:val="center"/>
+            </w:pPr>
+            <w:r>
+              <w:rPr>
+                <w:b w:val="0"/>
+                <w:sz w:val="20"/>
+              </w:rPr>
+            </w:r>
+          </w:p>
+        </w:tc>
+        <w:tc>
+          <w:tcPr>
+            <w:tcW w:type="dxa" w:w="1020"/>
+          </w:tcPr>
+          <w:p>
+            <w:pPr>
+              <w:spacing w:after="0"/>
+              <w:jc w:val="center"/>
+            </w:pPr>
+            <w:r>
+              <w:rPr>
+                <w:b w:val="0"/>
+                <w:sz w:val="20"/>
+              </w:rPr>
+            </w:r>
+          </w:p>
+        </w:tc>
+        <w:tc>
+          <w:tcPr>
+            <w:tcW w:type="dxa" w:w="1361"/>
+          </w:tcPr>
+          <w:p>
+            <w:pPr>
+              <w:spacing w:after="0"/>
+              <w:jc w:val="center"/>
+            </w:pPr>
+            <w:r>
+              <w:rPr>
+                <w:b w:val="0"/>
+                <w:sz w:val="20"/>
+              </w:rPr>
+            </w:r>
+          </w:p>
+        </w:tc>
+        <w:tc>
+          <w:tcPr>
+            <w:tcW w:type="dxa" w:w="1134"/>
+          </w:tcPr>
+          <w:p>
+            <w:pPr>
+              <w:spacing w:after="0"/>
               <w:jc w:val="center"/>
             </w:pPr>
             <w:r>
               <w:rPr>
                 <w:b/>
-              </w:rPr>
-              <w:t>Q8</w:t>
-            </w:r>
-          </w:p>
-        </w:tc>
-        <w:tc>
-          <w:tcPr>
-            <w:tcW w:type="dxa" w:w="1247"/>
-          </w:tcPr>
-          <w:p>
-            <w:pPr>
-              <w:jc w:val="center"/>
-            </w:pPr>
-            <w:r>
-              <w:t>7</w:t>
-            </w:r>
-          </w:p>
-        </w:tc>
-        <w:tc>
-          <w:tcPr>
-            <w:tcW w:type="dxa" w:w="1701"/>
-          </w:tcPr>
-          <w:p>
-            <w:r/>
-          </w:p>
-        </w:tc>
-      </w:tr>
-      <w:tr>
-        <w:tc>
-          <w:tcPr>
-            <w:tcW w:type="dxa" w:w="1247"/>
-          </w:tcPr>
-          <w:p>
-            <w:pPr>
-              <w:jc w:val="center"/>
-            </w:pPr>
-            <w:r>
-              <w:rPr>
-                <w:b/>
-              </w:rPr>
-              <w:t>Q9</w:t>
-            </w:r>
-          </w:p>
-        </w:tc>
-        <w:tc>
-          <w:tcPr>
-            <w:tcW w:type="dxa" w:w="1247"/>
-          </w:tcPr>
-          <w:p>
-            <w:pPr>
-              <w:jc w:val="center"/>
-            </w:pPr>
-            <w:r>
-              <w:t>7</w:t>
-            </w:r>
-          </w:p>
-        </w:tc>
-        <w:tc>
-          <w:tcPr>
-            <w:tcW w:type="dxa" w:w="1701"/>
-          </w:tcPr>
-          <w:p>
-            <w:r/>
-          </w:p>
-        </w:tc>
-      </w:tr>
-      <w:tr>
-        <w:tc>
-          <w:tcPr>
-            <w:tcW w:type="dxa" w:w="1247"/>
-          </w:tcPr>
-          <w:p>
-            <w:pPr>
-              <w:jc w:val="center"/>
-            </w:pPr>
-            <w:r>
-              <w:rPr>
-                <w:b/>
-              </w:rPr>
-              <w:t>Q10</w:t>
-            </w:r>
-          </w:p>
-        </w:tc>
-        <w:tc>
-          <w:tcPr>
-            <w:tcW w:type="dxa" w:w="1247"/>
-          </w:tcPr>
-          <w:p>
-            <w:pPr>
-              <w:jc w:val="center"/>
-            </w:pPr>
-            <w:r>
-              <w:t>8</w:t>
-            </w:r>
-          </w:p>
-        </w:tc>
-        <w:tc>
-          <w:tcPr>
-            <w:tcW w:type="dxa" w:w="1701"/>
-          </w:tcPr>
-          <w:p>
-            <w:r/>
-          </w:p>
-        </w:tc>
-      </w:tr>
-      <w:tr>
-        <w:tc>
-          <w:tcPr>
-            <w:tcW w:type="dxa" w:w="1247"/>
-          </w:tcPr>
-          <w:p>
-            <w:pPr>
-              <w:jc w:val="center"/>
-            </w:pPr>
-            <w:r>
-              <w:rPr>
-                <w:b/>
-              </w:rPr>
-              <w:t>Q11</w:t>
-            </w:r>
-          </w:p>
-        </w:tc>
-        <w:tc>
-          <w:tcPr>
-            <w:tcW w:type="dxa" w:w="1247"/>
-          </w:tcPr>
-          <w:p>
-            <w:pPr>
-              <w:jc w:val="center"/>
-            </w:pPr>
-            <w:r>
-              <w:t>10</w:t>
-            </w:r>
-          </w:p>
-        </w:tc>
-        <w:tc>
-          <w:tcPr>
-            <w:tcW w:type="dxa" w:w="1701"/>
-          </w:tcPr>
-          <w:p>
-            <w:r/>
-          </w:p>
-        </w:tc>
-      </w:tr>
-      <w:tr>
-        <w:tc>
-          <w:tcPr>
-            <w:tcW w:type="dxa" w:w="1247"/>
-          </w:tcPr>
-          <w:p>
-            <w:pPr>
-              <w:jc w:val="center"/>
-            </w:pPr>
-            <w:r>
-              <w:rPr>
-                <w:b/>
-              </w:rPr>
-              <w:t>Q12</w:t>
-            </w:r>
-          </w:p>
-        </w:tc>
-        <w:tc>
-          <w:tcPr>
-            <w:tcW w:type="dxa" w:w="1247"/>
-          </w:tcPr>
-          <w:p>
-            <w:pPr>
-              <w:jc w:val="center"/>
-            </w:pPr>
-            <w:r>
-              <w:t>10</w:t>
-            </w:r>
-          </w:p>
-        </w:tc>
-        <w:tc>
-          <w:tcPr>
-            <w:tcW w:type="dxa" w:w="1701"/>
-          </w:tcPr>
-          <w:p>
-            <w:r/>
-          </w:p>
-        </w:tc>
-      </w:tr>
-      <w:tr>
-        <w:tc>
-          <w:tcPr>
-            <w:tcW w:type="dxa" w:w="1247"/>
-          </w:tcPr>
-          <w:p>
-            <w:pPr>
-              <w:jc w:val="center"/>
-            </w:pPr>
-            <w:r>
-              <w:rPr>
-                <w:b/>
-              </w:rPr>
-              <w:t>Q13</w:t>
-            </w:r>
-          </w:p>
-        </w:tc>
-        <w:tc>
-          <w:tcPr>
-            <w:tcW w:type="dxa" w:w="1247"/>
-          </w:tcPr>
-          <w:p>
-            <w:pPr>
-              <w:jc w:val="center"/>
-            </w:pPr>
-            <w:r>
-              <w:t>12</w:t>
-            </w:r>
-          </w:p>
-        </w:tc>
-        <w:tc>
-          <w:tcPr>
-            <w:tcW w:type="dxa" w:w="1701"/>
-          </w:tcPr>
-          <w:p>
-            <w:r/>
-          </w:p>
-        </w:tc>
-      </w:tr>
-      <w:tr>
-        <w:tc>
-          <w:tcPr>
-            <w:tcW w:type="dxa" w:w="1247"/>
-          </w:tcPr>
-          <w:p>
-            <w:pPr>
-              <w:jc w:val="center"/>
-            </w:pPr>
-            <w:r>
-              <w:rPr>
-                <w:b/>
+                <w:sz w:val="20"/>
               </w:rPr>
               <w:t>Total</w:t>
             </w:r>
@@ -886,25 +1176,38 @@
         </w:tc>
         <w:tc>
           <w:tcPr>
-            <w:tcW w:type="dxa" w:w="1247"/>
+            <w:tcW w:type="dxa" w:w="1020"/>
           </w:tcPr>
           <w:p>
             <w:pPr>
+              <w:spacing w:after="0"/>
               <w:jc w:val="center"/>
             </w:pPr>
             <w:r>
               <w:rPr>
                 <w:b/>
+                <w:sz w:val="20"/>
               </w:rPr>
-              <w:t>86</w:t>
+              <w:t>90</w:t>
             </w:r>
           </w:p>
         </w:tc>
         <w:tc>
           <w:tcPr>
-            <w:tcW w:type="dxa" w:w="1701"/>
+            <w:tcW w:type="dxa" w:w="1361"/>
           </w:tcPr>
-          <w:p/>
+          <w:p>
+            <w:pPr>
+              <w:spacing w:after="0"/>
+              <w:jc w:val="center"/>
+            </w:pPr>
+            <w:r>
+              <w:rPr>
+                <w:b w:val="0"/>
+                <w:sz w:val="20"/>
+              </w:rPr>
+            </w:r>
+          </w:p>
         </w:tc>
       </w:tr>
     </w:tbl>
@@ -924,7 +1227,7 @@
           <w:i w:val="0"/>
           <w:sz w:val="20"/>
         </w:rPr>
-        <w:t>This document consists of 16 printed pages including the cover page.</w:t>
+        <w:t>This document consists of 18 printed pages including the cover page.</w:t>
       </w:r>
     </w:p>
     <w:p>
@@ -1399,6 +1702,116 @@
         <w:tab/>
       </w:r>
       <w:r>
+        <w:t>Do not use a calculator in this question.</w:t>
+      </w:r>
+    </w:p>
+    <w:p>
+      <w:pPr>
+        <w:tabs>
+          <w:tab w:pos="1474" w:val="left"/>
+          <w:tab w:pos="9071" w:val="right"/>
+        </w:tabs>
+        <w:spacing w:after="0"/>
+        <w:ind w:left="1474" w:hanging="624"/>
+      </w:pPr>
+      <w:r>
+        <w:rPr>
+          <w:b/>
+        </w:rPr>
+        <w:t>(a)</w:t>
+        <w:tab/>
+      </w:r>
+      <w:r>
+        <w:t>Simplify  7 / (3 − √2), giving your answer in the form  a + b√2, where a and b are integers.</w:t>
+      </w:r>
+      <w:r>
+        <w:tab/>
+        <w:t>[2]</w:t>
+      </w:r>
+    </w:p>
+    <w:p>
+      <w:pPr>
+        <w:spacing w:after="0"/>
+      </w:pPr>
+    </w:p>
+    <w:p>
+      <w:pPr>
+        <w:spacing w:after="0"/>
+      </w:pPr>
+    </w:p>
+    <w:p>
+      <w:pPr>
+        <w:spacing w:after="0"/>
+      </w:pPr>
+    </w:p>
+    <w:p>
+      <w:pPr>
+        <w:spacing w:after="0"/>
+      </w:pPr>
+    </w:p>
+    <w:p>
+      <w:pPr>
+        <w:spacing w:after="0"/>
+      </w:pPr>
+    </w:p>
+    <w:p>
+      <w:pPr>
+        <w:spacing w:after="0"/>
+      </w:pPr>
+    </w:p>
+    <w:p>
+      <w:pPr>
+        <w:spacing w:after="0"/>
+      </w:pPr>
+    </w:p>
+    <w:p>
+      <w:pPr>
+        <w:spacing w:after="0"/>
+      </w:pPr>
+    </w:p>
+    <w:p>
+      <w:pPr>
+        <w:tabs>
+          <w:tab w:pos="1474" w:val="left"/>
+          <w:tab w:pos="9071" w:val="right"/>
+        </w:tabs>
+        <w:spacing w:after="0"/>
+        <w:ind w:left="1474" w:hanging="624"/>
+      </w:pPr>
+      <w:r>
+        <w:rPr>
+          <w:b/>
+        </w:rPr>
+        <w:t>(b)</w:t>
+        <w:tab/>
+      </w:r>
+      <w:r>
+        <w:t>Given that  (2 + √3)x = 5 + 4√3, find the value of x in the form  a + b√3, where a and b are integers.</w:t>
+      </w:r>
+      <w:r>
+        <w:tab/>
+        <w:t>[2]</w:t>
+      </w:r>
+    </w:p>
+    <w:p>
+      <w:r>
+        <w:br w:type="page"/>
+      </w:r>
+    </w:p>
+    <w:p>
+      <w:pPr>
+        <w:tabs>
+          <w:tab w:pos="850" w:val="left"/>
+          <w:tab w:pos="9071" w:val="right"/>
+        </w:tabs>
+        <w:spacing w:after="0"/>
+        <w:ind w:left="850" w:hanging="850"/>
+      </w:pPr>
+      <w:r>
+        <w:t>3</w:t>
+        <w:tab/>
+      </w:r>
+      <w:r>
         <w:t>It is given that  sin A = − 1/√5  and  tan B = 3/4, where A and B are in the same quadrant. Find the value of p if  cos(A − B) = p√5.</w:t>
       </w:r>
       <w:r>
@@ -1407,71 +1820,6 @@
       </w:r>
     </w:p>
     <w:p>
-      <w:pPr>
-        <w:spacing w:after="0"/>
-      </w:pPr>
-    </w:p>
-    <w:p>
-      <w:pPr>
-        <w:spacing w:after="0"/>
-      </w:pPr>
-    </w:p>
-    <w:p>
-      <w:pPr>
-        <w:spacing w:after="0"/>
-      </w:pPr>
-    </w:p>
-    <w:p>
-      <w:pPr>
-        <w:spacing w:after="0"/>
-      </w:pPr>
-    </w:p>
-    <w:p>
-      <w:pPr>
-        <w:spacing w:after="0"/>
-      </w:pPr>
-    </w:p>
-    <w:p>
-      <w:pPr>
-        <w:spacing w:after="0"/>
-      </w:pPr>
-    </w:p>
-    <w:p>
-      <w:pPr>
-        <w:spacing w:after="0"/>
-      </w:pPr>
-    </w:p>
-    <w:p>
-      <w:pPr>
-        <w:spacing w:after="0"/>
-      </w:pPr>
-    </w:p>
-    <w:p>
-      <w:pPr>
-        <w:spacing w:after="0"/>
-      </w:pPr>
-    </w:p>
-    <w:p>
-      <w:pPr>
-        <w:spacing w:after="0"/>
-      </w:pPr>
-    </w:p>
-    <w:p>
-      <w:pPr>
-        <w:spacing w:after="0"/>
-      </w:pPr>
-    </w:p>
-    <w:p>
-      <w:pPr>
-        <w:spacing w:after="0"/>
-      </w:pPr>
-    </w:p>
-    <w:p>
-      <w:pPr>
-        <w:spacing w:after="0"/>
-      </w:pPr>
-    </w:p>
-    <w:p>
       <w:r>
         <w:br w:type="page"/>
       </w:r>
@@ -1486,7 +1834,7 @@
         <w:ind w:left="850" w:hanging="850"/>
       </w:pPr>
       <w:r>
-        <w:t>3</w:t>
+        <w:t>4</w:t>
         <w:tab/>
       </w:r>
       <w:r/>
@@ -1590,61 +1938,6 @@
       </w:r>
     </w:p>
     <w:p>
-      <w:pPr>
-        <w:spacing w:after="0"/>
-      </w:pPr>
-    </w:p>
-    <w:p>
-      <w:pPr>
-        <w:spacing w:after="0"/>
-      </w:pPr>
-    </w:p>
-    <w:p>
-      <w:pPr>
-        <w:spacing w:after="0"/>
-      </w:pPr>
-    </w:p>
-    <w:p>
-      <w:pPr>
-        <w:spacing w:after="0"/>
-      </w:pPr>
-    </w:p>
-    <w:p>
-      <w:pPr>
-        <w:spacing w:after="0"/>
-      </w:pPr>
-    </w:p>
-    <w:p>
-      <w:pPr>
-        <w:spacing w:after="0"/>
-      </w:pPr>
-    </w:p>
-    <w:p>
-      <w:pPr>
-        <w:spacing w:after="0"/>
-      </w:pPr>
-    </w:p>
-    <w:p>
-      <w:pPr>
-        <w:spacing w:after="0"/>
-      </w:pPr>
-    </w:p>
-    <w:p>
-      <w:pPr>
-        <w:spacing w:after="0"/>
-      </w:pPr>
-    </w:p>
-    <w:p>
-      <w:pPr>
-        <w:spacing w:after="0"/>
-      </w:pPr>
-    </w:p>
-    <w:p>
-      <w:pPr>
-        <w:spacing w:after="0"/>
-      </w:pPr>
-    </w:p>
-    <w:p>
       <w:r>
         <w:br w:type="page"/>
       </w:r>
@@ -1659,7 +1952,7 @@
         <w:ind w:left="850" w:hanging="850"/>
       </w:pPr>
       <w:r>
-        <w:t>4</w:t>
+        <w:t>5</w:t>
         <w:tab/>
       </w:r>
       <w:r>
@@ -1677,12 +1970,38 @@
         <w:jc w:val="center"/>
       </w:pPr>
       <w:r>
-        <w:rPr>
-          <w:b w:val="0"/>
-          <w:i/>
-          <w:sz w:val="22"/>
-        </w:rPr>
-        <w:t>[Diagram: a rectangle of width q m and height p m, with an equilateral triangle of side q m mounted on its top edge.]</w:t>
+        <w:drawing>
+          <wp:inline xmlns:a="http://schemas.openxmlformats.org/drawingml/2006/main" xmlns:pic="http://schemas.openxmlformats.org/drawingml/2006/picture">
+            <wp:extent cx="2015999" cy="2992045"/>
+            <wp:docPr id="1" name="Picture 1"/>
+            <wp:cNvGraphicFramePr>
+              <a:graphicFrameLocks noChangeAspect="1"/>
+            </wp:cNvGraphicFramePr>
+            <a:graphic>
+              <a:graphicData uri="http://schemas.openxmlformats.org/drawingml/2006/picture">
+                <pic:pic>
+                  <pic:nvPicPr>
+                    <pic:cNvPr id="0" name="plaque.png"/>
+                    <pic:cNvPicPr/>
+                  </pic:nvPicPr>
+                  <pic:blipFill>
+                    <a:blip r:embed="rId9"/>
+                    <a:stretch>
+                      <a:fillRect/>
+                    </a:stretch>
+                  </pic:blipFill>
+                  <pic:spPr>
+                    <a:xfrm>
+                      <a:off x="0" y="0"/>
+                      <a:ext cx="2015999" cy="2992045"/>
+                    </a:xfrm>
+                    <a:prstGeom prst="rect"/>
+                  </pic:spPr>
+                </pic:pic>
+              </a:graphicData>
+            </a:graphic>
+          </wp:inline>
+        </w:drawing>
       </w:r>
     </w:p>
     <w:p>
@@ -1784,61 +2103,6 @@
       </w:r>
     </w:p>
     <w:p>
-      <w:pPr>
-        <w:spacing w:after="0"/>
-      </w:pPr>
-    </w:p>
-    <w:p>
-      <w:pPr>
-        <w:spacing w:after="0"/>
-      </w:pPr>
-    </w:p>
-    <w:p>
-      <w:pPr>
-        <w:spacing w:after="0"/>
-      </w:pPr>
-    </w:p>
-    <w:p>
-      <w:pPr>
-        <w:spacing w:after="0"/>
-      </w:pPr>
-    </w:p>
-    <w:p>
-      <w:pPr>
-        <w:spacing w:after="0"/>
-      </w:pPr>
-    </w:p>
-    <w:p>
-      <w:pPr>
-        <w:spacing w:after="0"/>
-      </w:pPr>
-    </w:p>
-    <w:p>
-      <w:pPr>
-        <w:spacing w:after="0"/>
-      </w:pPr>
-    </w:p>
-    <w:p>
-      <w:pPr>
-        <w:spacing w:after="0"/>
-      </w:pPr>
-    </w:p>
-    <w:p>
-      <w:pPr>
-        <w:spacing w:after="0"/>
-      </w:pPr>
-    </w:p>
-    <w:p>
-      <w:pPr>
-        <w:spacing w:after="0"/>
-      </w:pPr>
-    </w:p>
-    <w:p>
-      <w:pPr>
-        <w:spacing w:after="0"/>
-      </w:pPr>
-    </w:p>
-    <w:p>
       <w:r>
         <w:br w:type="page"/>
       </w:r>
@@ -1853,7 +2117,7 @@
         <w:ind w:left="850" w:hanging="850"/>
       </w:pPr>
       <w:r>
-        <w:t>5</w:t>
+        <w:t>6</w:t>
         <w:tab/>
       </w:r>
       <w:r>
@@ -1865,126 +2129,6 @@
       </w:r>
     </w:p>
     <w:p>
-      <w:pPr>
-        <w:spacing w:after="0"/>
-      </w:pPr>
-    </w:p>
-    <w:p>
-      <w:pPr>
-        <w:spacing w:after="0"/>
-      </w:pPr>
-    </w:p>
-    <w:p>
-      <w:pPr>
-        <w:spacing w:after="0"/>
-      </w:pPr>
-    </w:p>
-    <w:p>
-      <w:pPr>
-        <w:spacing w:after="0"/>
-      </w:pPr>
-    </w:p>
-    <w:p>
-      <w:pPr>
-        <w:spacing w:after="0"/>
-      </w:pPr>
-    </w:p>
-    <w:p>
-      <w:pPr>
-        <w:spacing w:after="0"/>
-      </w:pPr>
-    </w:p>
-    <w:p>
-      <w:pPr>
-        <w:spacing w:after="0"/>
-      </w:pPr>
-    </w:p>
-    <w:p>
-      <w:pPr>
-        <w:spacing w:after="0"/>
-      </w:pPr>
-    </w:p>
-    <w:p>
-      <w:pPr>
-        <w:spacing w:after="0"/>
-      </w:pPr>
-    </w:p>
-    <w:p>
-      <w:pPr>
-        <w:spacing w:after="0"/>
-      </w:pPr>
-    </w:p>
-    <w:p>
-      <w:pPr>
-        <w:spacing w:after="0"/>
-      </w:pPr>
-    </w:p>
-    <w:p>
-      <w:pPr>
-        <w:spacing w:after="0"/>
-      </w:pPr>
-    </w:p>
-    <w:p>
-      <w:pPr>
-        <w:spacing w:after="0"/>
-      </w:pPr>
-    </w:p>
-    <w:p>
-      <w:pPr>
-        <w:spacing w:after="0"/>
-      </w:pPr>
-    </w:p>
-    <w:p>
-      <w:pPr>
-        <w:spacing w:after="0"/>
-      </w:pPr>
-    </w:p>
-    <w:p>
-      <w:pPr>
-        <w:spacing w:after="0"/>
-      </w:pPr>
-    </w:p>
-    <w:p>
-      <w:pPr>
-        <w:spacing w:after="0"/>
-      </w:pPr>
-    </w:p>
-    <w:p>
-      <w:pPr>
-        <w:spacing w:after="0"/>
-      </w:pPr>
-    </w:p>
-    <w:p>
-      <w:pPr>
-        <w:spacing w:after="0"/>
-      </w:pPr>
-    </w:p>
-    <w:p>
-      <w:pPr>
-        <w:spacing w:after="0"/>
-      </w:pPr>
-    </w:p>
-    <w:p>
-      <w:pPr>
-        <w:spacing w:after="0"/>
-      </w:pPr>
-    </w:p>
-    <w:p>
-      <w:pPr>
-        <w:spacing w:after="0"/>
-      </w:pPr>
-    </w:p>
-    <w:p>
-      <w:pPr>
-        <w:spacing w:after="0"/>
-      </w:pPr>
-    </w:p>
-    <w:p>
-      <w:pPr>
-        <w:spacing w:after="0"/>
-      </w:pPr>
-    </w:p>
-    <w:p>
       <w:r>
         <w:br w:type="page"/>
       </w:r>
@@ -1999,7 +2143,7 @@
         <w:ind w:left="850" w:hanging="850"/>
       </w:pPr>
       <w:r>
-        <w:t>6</w:t>
+        <w:t>7</w:t>
         <w:tab/>
       </w:r>
       <w:r>
@@ -2011,126 +2155,6 @@
       </w:r>
     </w:p>
     <w:p>
-      <w:pPr>
-        <w:spacing w:after="0"/>
-      </w:pPr>
-    </w:p>
-    <w:p>
-      <w:pPr>
-        <w:spacing w:after="0"/>
-      </w:pPr>
-    </w:p>
-    <w:p>
-      <w:pPr>
-        <w:spacing w:after="0"/>
-      </w:pPr>
-    </w:p>
-    <w:p>
-      <w:pPr>
-        <w:spacing w:after="0"/>
-      </w:pPr>
-    </w:p>
-    <w:p>
-      <w:pPr>
-        <w:spacing w:after="0"/>
-      </w:pPr>
-    </w:p>
-    <w:p>
-      <w:pPr>
-        <w:spacing w:after="0"/>
-      </w:pPr>
-    </w:p>
-    <w:p>
-      <w:pPr>
-        <w:spacing w:after="0"/>
-      </w:pPr>
-    </w:p>
-    <w:p>
-      <w:pPr>
-        <w:spacing w:after="0"/>
-      </w:pPr>
-    </w:p>
-    <w:p>
-      <w:pPr>
-        <w:spacing w:after="0"/>
-      </w:pPr>
-    </w:p>
-    <w:p>
-      <w:pPr>
-        <w:spacing w:after="0"/>
-      </w:pPr>
-    </w:p>
-    <w:p>
-      <w:pPr>
-        <w:spacing w:after="0"/>
-      </w:pPr>
-    </w:p>
-    <w:p>
-      <w:pPr>
-        <w:spacing w:after="0"/>
-      </w:pPr>
-    </w:p>
-    <w:p>
-      <w:pPr>
-        <w:spacing w:after="0"/>
-      </w:pPr>
-    </w:p>
-    <w:p>
-      <w:pPr>
-        <w:spacing w:after="0"/>
-      </w:pPr>
-    </w:p>
-    <w:p>
-      <w:pPr>
-        <w:spacing w:after="0"/>
-      </w:pPr>
-    </w:p>
-    <w:p>
-      <w:pPr>
-        <w:spacing w:after="0"/>
-      </w:pPr>
-    </w:p>
-    <w:p>
-      <w:pPr>
-        <w:spacing w:after="0"/>
-      </w:pPr>
-    </w:p>
-    <w:p>
-      <w:pPr>
-        <w:spacing w:after="0"/>
-      </w:pPr>
-    </w:p>
-    <w:p>
-      <w:pPr>
-        <w:spacing w:after="0"/>
-      </w:pPr>
-    </w:p>
-    <w:p>
-      <w:pPr>
-        <w:spacing w:after="0"/>
-      </w:pPr>
-    </w:p>
-    <w:p>
-      <w:pPr>
-        <w:spacing w:after="0"/>
-      </w:pPr>
-    </w:p>
-    <w:p>
-      <w:pPr>
-        <w:spacing w:after="0"/>
-      </w:pPr>
-    </w:p>
-    <w:p>
-      <w:pPr>
-        <w:spacing w:after="0"/>
-      </w:pPr>
-    </w:p>
-    <w:p>
-      <w:pPr>
-        <w:spacing w:after="0"/>
-      </w:pPr>
-    </w:p>
-    <w:p>
       <w:r>
         <w:br w:type="page"/>
       </w:r>
@@ -2145,7 +2169,7 @@
         <w:ind w:left="850" w:hanging="850"/>
       </w:pPr>
       <w:r>
-        <w:t>7</w:t>
+        <w:t>8</w:t>
         <w:tab/>
       </w:r>
       <w:r>
@@ -2300,41 +2324,6 @@
       </w:r>
     </w:p>
     <w:p>
-      <w:pPr>
-        <w:spacing w:after="0"/>
-      </w:pPr>
-    </w:p>
-    <w:p>
-      <w:pPr>
-        <w:spacing w:after="0"/>
-      </w:pPr>
-    </w:p>
-    <w:p>
-      <w:pPr>
-        <w:spacing w:after="0"/>
-      </w:pPr>
-    </w:p>
-    <w:p>
-      <w:pPr>
-        <w:spacing w:after="0"/>
-      </w:pPr>
-    </w:p>
-    <w:p>
-      <w:pPr>
-        <w:spacing w:after="0"/>
-      </w:pPr>
-    </w:p>
-    <w:p>
-      <w:pPr>
-        <w:spacing w:after="0"/>
-      </w:pPr>
-    </w:p>
-    <w:p>
-      <w:pPr>
-        <w:spacing w:after="0"/>
-      </w:pPr>
-    </w:p>
-    <w:p>
       <w:r>
         <w:br w:type="page"/>
       </w:r>
@@ -2349,7 +2338,7 @@
         <w:ind w:left="850" w:hanging="850"/>
       </w:pPr>
       <w:r>
-        <w:t>8</w:t>
+        <w:t>9</w:t>
         <w:tab/>
       </w:r>
       <w:r>
@@ -2504,58 +2493,39 @@
         <w:jc w:val="center"/>
       </w:pPr>
       <w:r>
-        <w:rPr>
-          <w:b w:val="0"/>
-          <w:i/>
-          <w:sz w:val="22"/>
-        </w:rPr>
-        <w:t>[Axes provided: x from 0 to 2π marked at π/2, π, 3π/2, 2π ; y marked at 4 and −10.]</w:t>
+        <w:drawing>
+          <wp:inline xmlns:a="http://schemas.openxmlformats.org/drawingml/2006/main" xmlns:pic="http://schemas.openxmlformats.org/drawingml/2006/picture">
+            <wp:extent cx="4860000" cy="3181665"/>
+            <wp:docPr id="2" name="Picture 2"/>
+            <wp:cNvGraphicFramePr>
+              <a:graphicFrameLocks noChangeAspect="1"/>
+            </wp:cNvGraphicFramePr>
+            <a:graphic>
+              <a:graphicData uri="http://schemas.openxmlformats.org/drawingml/2006/picture">
+                <pic:pic>
+                  <pic:nvPicPr>
+                    <pic:cNvPr id="0" name="trigaxes.png"/>
+                    <pic:cNvPicPr/>
+                  </pic:nvPicPr>
+                  <pic:blipFill>
+                    <a:blip r:embed="rId10"/>
+                    <a:stretch>
+                      <a:fillRect/>
+                    </a:stretch>
+                  </pic:blipFill>
+                  <pic:spPr>
+                    <a:xfrm>
+                      <a:off x="0" y="0"/>
+                      <a:ext cx="4860000" cy="3181665"/>
+                    </a:xfrm>
+                    <a:prstGeom prst="rect"/>
+                  </pic:spPr>
+                </pic:pic>
+              </a:graphicData>
+            </a:graphic>
+          </wp:inline>
+        </w:drawing>
       </w:r>
-    </w:p>
-    <w:p>
-      <w:pPr>
-        <w:spacing w:after="0"/>
-      </w:pPr>
-    </w:p>
-    <w:p>
-      <w:pPr>
-        <w:spacing w:after="0"/>
-      </w:pPr>
-    </w:p>
-    <w:p>
-      <w:pPr>
-        <w:spacing w:after="0"/>
-      </w:pPr>
-    </w:p>
-    <w:p>
-      <w:pPr>
-        <w:spacing w:after="0"/>
-      </w:pPr>
-    </w:p>
-    <w:p>
-      <w:pPr>
-        <w:spacing w:after="0"/>
-      </w:pPr>
-    </w:p>
-    <w:p>
-      <w:pPr>
-        <w:spacing w:after="0"/>
-      </w:pPr>
-    </w:p>
-    <w:p>
-      <w:pPr>
-        <w:spacing w:after="0"/>
-      </w:pPr>
-    </w:p>
-    <w:p>
-      <w:pPr>
-        <w:spacing w:after="0"/>
-      </w:pPr>
-    </w:p>
-    <w:p>
-      <w:pPr>
-        <w:spacing w:after="0"/>
-      </w:pPr>
     </w:p>
     <w:p>
       <w:r>
@@ -2572,7 +2542,7 @@
         <w:ind w:left="850" w:hanging="850"/>
       </w:pPr>
       <w:r>
-        <w:t>9</w:t>
+        <w:t>10</w:t>
         <w:tab/>
       </w:r>
       <w:r>
@@ -2673,61 +2643,6 @@
       </w:r>
     </w:p>
     <w:p>
-      <w:pPr>
-        <w:spacing w:after="0"/>
-      </w:pPr>
-    </w:p>
-    <w:p>
-      <w:pPr>
-        <w:spacing w:after="0"/>
-      </w:pPr>
-    </w:p>
-    <w:p>
-      <w:pPr>
-        <w:spacing w:after="0"/>
-      </w:pPr>
-    </w:p>
-    <w:p>
-      <w:pPr>
-        <w:spacing w:after="0"/>
-      </w:pPr>
-    </w:p>
-    <w:p>
-      <w:pPr>
-        <w:spacing w:after="0"/>
-      </w:pPr>
-    </w:p>
-    <w:p>
-      <w:pPr>
-        <w:spacing w:after="0"/>
-      </w:pPr>
-    </w:p>
-    <w:p>
-      <w:pPr>
-        <w:spacing w:after="0"/>
-      </w:pPr>
-    </w:p>
-    <w:p>
-      <w:pPr>
-        <w:spacing w:after="0"/>
-      </w:pPr>
-    </w:p>
-    <w:p>
-      <w:pPr>
-        <w:spacing w:after="0"/>
-      </w:pPr>
-    </w:p>
-    <w:p>
-      <w:pPr>
-        <w:spacing w:after="0"/>
-      </w:pPr>
-    </w:p>
-    <w:p>
-      <w:pPr>
-        <w:spacing w:after="0"/>
-      </w:pPr>
-    </w:p>
-    <w:p>
       <w:r>
         <w:br w:type="page"/>
       </w:r>
@@ -2742,7 +2657,7 @@
         <w:ind w:left="850" w:hanging="850"/>
       </w:pPr>
       <w:r>
-        <w:t>10</w:t>
+        <w:t>11</w:t>
         <w:tab/>
       </w:r>
       <w:r/>
@@ -2851,71 +2766,6 @@
       </w:r>
     </w:p>
     <w:p>
-      <w:pPr>
-        <w:spacing w:after="0"/>
-      </w:pPr>
-    </w:p>
-    <w:p>
-      <w:pPr>
-        <w:spacing w:after="0"/>
-      </w:pPr>
-    </w:p>
-    <w:p>
-      <w:pPr>
-        <w:spacing w:after="0"/>
-      </w:pPr>
-    </w:p>
-    <w:p>
-      <w:pPr>
-        <w:spacing w:after="0"/>
-      </w:pPr>
-    </w:p>
-    <w:p>
-      <w:pPr>
-        <w:spacing w:after="0"/>
-      </w:pPr>
-    </w:p>
-    <w:p>
-      <w:pPr>
-        <w:spacing w:after="0"/>
-      </w:pPr>
-    </w:p>
-    <w:p>
-      <w:pPr>
-        <w:spacing w:after="0"/>
-      </w:pPr>
-    </w:p>
-    <w:p>
-      <w:pPr>
-        <w:spacing w:after="0"/>
-      </w:pPr>
-    </w:p>
-    <w:p>
-      <w:pPr>
-        <w:spacing w:after="0"/>
-      </w:pPr>
-    </w:p>
-    <w:p>
-      <w:pPr>
-        <w:spacing w:after="0"/>
-      </w:pPr>
-    </w:p>
-    <w:p>
-      <w:pPr>
-        <w:spacing w:after="0"/>
-      </w:pPr>
-    </w:p>
-    <w:p>
-      <w:pPr>
-        <w:spacing w:after="0"/>
-      </w:pPr>
-    </w:p>
-    <w:p>
-      <w:pPr>
-        <w:spacing w:after="0"/>
-      </w:pPr>
-    </w:p>
-    <w:p>
       <w:r>
         <w:br w:type="page"/>
       </w:r>
@@ -2930,7 +2780,7 @@
         <w:ind w:left="850" w:hanging="850"/>
       </w:pPr>
       <w:r>
-        <w:t>11</w:t>
+        <w:t>12</w:t>
         <w:tab/>
       </w:r>
       <w:r/>
@@ -3079,66 +2929,6 @@
       </w:r>
     </w:p>
     <w:p>
-      <w:pPr>
-        <w:spacing w:after="0"/>
-      </w:pPr>
-    </w:p>
-    <w:p>
-      <w:pPr>
-        <w:spacing w:after="0"/>
-      </w:pPr>
-    </w:p>
-    <w:p>
-      <w:pPr>
-        <w:spacing w:after="0"/>
-      </w:pPr>
-    </w:p>
-    <w:p>
-      <w:pPr>
-        <w:spacing w:after="0"/>
-      </w:pPr>
-    </w:p>
-    <w:p>
-      <w:pPr>
-        <w:spacing w:after="0"/>
-      </w:pPr>
-    </w:p>
-    <w:p>
-      <w:pPr>
-        <w:spacing w:after="0"/>
-      </w:pPr>
-    </w:p>
-    <w:p>
-      <w:pPr>
-        <w:spacing w:after="0"/>
-      </w:pPr>
-    </w:p>
-    <w:p>
-      <w:pPr>
-        <w:spacing w:after="0"/>
-      </w:pPr>
-    </w:p>
-    <w:p>
-      <w:pPr>
-        <w:spacing w:after="0"/>
-      </w:pPr>
-    </w:p>
-    <w:p>
-      <w:pPr>
-        <w:spacing w:after="0"/>
-      </w:pPr>
-    </w:p>
-    <w:p>
-      <w:pPr>
-        <w:spacing w:after="0"/>
-      </w:pPr>
-    </w:p>
-    <w:p>
-      <w:pPr>
-        <w:spacing w:after="0"/>
-      </w:pPr>
-    </w:p>
-    <w:p>
       <w:r>
         <w:br w:type="page"/>
       </w:r>
@@ -3153,7 +2943,7 @@
         <w:ind w:left="850" w:hanging="850"/>
       </w:pPr>
       <w:r>
-        <w:t>12</w:t>
+        <w:t>13</w:t>
         <w:tab/>
       </w:r>
       <w:r>
@@ -3418,7 +3208,7 @@
         <w:tab/>
       </w:r>
       <w:r>
-        <w:t>Explain how a straight line graph can be drawn to represent the formula, and draw it for the given data on the graph paper provided.</w:t>
+        <w:t>Explain how a straight line graph can be drawn to represent the formula, and draw it for the given data on the grid below.</w:t>
       </w:r>
       <w:r>
         <w:tab/>
@@ -3453,7 +3243,47 @@
     <w:p>
       <w:pPr>
         <w:spacing w:after="0"/>
-      </w:pPr>
+        <w:jc w:val="center"/>
+      </w:pPr>
+      <w:r>
+        <w:drawing>
+          <wp:inline xmlns:a="http://schemas.openxmlformats.org/drawingml/2006/main" xmlns:pic="http://schemas.openxmlformats.org/drawingml/2006/picture">
+            <wp:extent cx="5220000" cy="6763851"/>
+            <wp:docPr id="3" name="Picture 3"/>
+            <wp:cNvGraphicFramePr>
+              <a:graphicFrameLocks noChangeAspect="1"/>
+            </wp:cNvGraphicFramePr>
+            <a:graphic>
+              <a:graphicData uri="http://schemas.openxmlformats.org/drawingml/2006/picture">
+                <pic:pic>
+                  <pic:nvPicPr>
+                    <pic:cNvPr id="0" name="graphpaper.png"/>
+                    <pic:cNvPicPr/>
+                  </pic:nvPicPr>
+                  <pic:blipFill>
+                    <a:blip r:embed="rId11"/>
+                    <a:stretch>
+                      <a:fillRect/>
+                    </a:stretch>
+                  </pic:blipFill>
+                  <pic:spPr>
+                    <a:xfrm>
+                      <a:off x="0" y="0"/>
+                      <a:ext cx="5220000" cy="6763851"/>
+                    </a:xfrm>
+                    <a:prstGeom prst="rect"/>
+                  </pic:spPr>
+                </pic:pic>
+              </a:graphicData>
+            </a:graphic>
+          </wp:inline>
+        </w:drawing>
+      </w:r>
+    </w:p>
+    <w:p>
+      <w:r>
+        <w:br w:type="page"/>
+      </w:r>
     </w:p>
     <w:p>
       <w:pPr>
@@ -3544,36 +3374,6 @@
       </w:r>
     </w:p>
     <w:p>
-      <w:pPr>
-        <w:spacing w:after="0"/>
-      </w:pPr>
-    </w:p>
-    <w:p>
-      <w:pPr>
-        <w:spacing w:after="0"/>
-      </w:pPr>
-    </w:p>
-    <w:p>
-      <w:pPr>
-        <w:spacing w:after="0"/>
-      </w:pPr>
-    </w:p>
-    <w:p>
-      <w:pPr>
-        <w:spacing w:after="0"/>
-      </w:pPr>
-    </w:p>
-    <w:p>
-      <w:pPr>
-        <w:spacing w:after="0"/>
-      </w:pPr>
-    </w:p>
-    <w:p>
-      <w:pPr>
-        <w:spacing w:after="0"/>
-      </w:pPr>
-    </w:p>
-    <w:p>
       <w:r>
         <w:br w:type="page"/>
       </w:r>
@@ -3588,7 +3388,7 @@
         <w:ind w:left="850" w:hanging="850"/>
       </w:pPr>
       <w:r>
-        <w:t>13</w:t>
+        <w:t>14</w:t>
         <w:tab/>
       </w:r>
       <w:r/>
@@ -3705,66 +3505,6 @@
         <w:tab/>
         <w:t>[4]</w:t>
       </w:r>
-    </w:p>
-    <w:p>
-      <w:pPr>
-        <w:spacing w:after="0"/>
-      </w:pPr>
-    </w:p>
-    <w:p>
-      <w:pPr>
-        <w:spacing w:after="0"/>
-      </w:pPr>
-    </w:p>
-    <w:p>
-      <w:pPr>
-        <w:spacing w:after="0"/>
-      </w:pPr>
-    </w:p>
-    <w:p>
-      <w:pPr>
-        <w:spacing w:after="0"/>
-      </w:pPr>
-    </w:p>
-    <w:p>
-      <w:pPr>
-        <w:spacing w:after="0"/>
-      </w:pPr>
-    </w:p>
-    <w:p>
-      <w:pPr>
-        <w:spacing w:after="0"/>
-      </w:pPr>
-    </w:p>
-    <w:p>
-      <w:pPr>
-        <w:spacing w:after="0"/>
-      </w:pPr>
-    </w:p>
-    <w:p>
-      <w:pPr>
-        <w:spacing w:after="0"/>
-      </w:pPr>
-    </w:p>
-    <w:p>
-      <w:pPr>
-        <w:spacing w:after="0"/>
-      </w:pPr>
-    </w:p>
-    <w:p>
-      <w:pPr>
-        <w:spacing w:after="0"/>
-      </w:pPr>
-    </w:p>
-    <w:p>
-      <w:pPr>
-        <w:spacing w:after="0"/>
-      </w:pPr>
-    </w:p>
-    <w:p>
-      <w:pPr>
-        <w:spacing w:after="0"/>
-      </w:pPr>
     </w:p>
     <w:p>
       <w:r>

</xml_diff>

<commit_message>
Swap plaque question for partial fractions; trim linear law read-off
Aligns the paper with Fuhua's Sec 3 Express EOY, which tests partial
fractions in both 2024 and 2025 while the paper had none.

- Removed the plaque question (4 marks). With the calculus part out of
  scope it was two 'show' set-up parts leading nowhere, and its quadratic
  manipulation is already covered by Q4(i).
- Removed the linear law read-off part (2 marks), which repeated work
  already done in the preceding parts and left the topic overweight at 10
  marks against Fuhua's 6.
- Added partial fractions as Q7 (6 marks): (i) explain why a linear
  numerator is needed over the quadratic factor, (ii) decompose. Splits
  as 2/(x+1) + (x+2)/(x^2+4), verified numerically.

Still 14 questions, 90 marks, 18 pages.

Co-Authored-By: Claude Opus 5 <noreply@anthropic.com>
Claude-Session: https://claude.ai/code/session_01F7ETHVetjPb8yks4PaCygS
</commit_message>
<xml_diff>
--- a/Sec3_EOY_AMath_Paper.docx
+++ b/Sec3_EOY_AMath_Paper.docx
@@ -808,7 +808,7 @@
                 <w:b w:val="0"/>
                 <w:sz w:val="20"/>
               </w:rPr>
-              <w:t>4</w:t>
+              <w:t>5</w:t>
             </w:r>
           </w:p>
         </w:tc>
@@ -969,7 +969,7 @@
                 <w:b w:val="0"/>
                 <w:sz w:val="20"/>
               </w:rPr>
-              <w:t>10</w:t>
+              <w:t>8</w:t>
             </w:r>
           </w:p>
         </w:tc>
@@ -1024,7 +1024,7 @@
                 <w:b w:val="0"/>
                 <w:sz w:val="20"/>
               </w:rPr>
-              <w:t>5</w:t>
+              <w:t>6</w:t>
             </w:r>
           </w:p>
         </w:tc>
@@ -3755,294 +3755,6 @@
         <w:tab/>
       </w:r>
       <w:r>
-        <w:t xml:space="preserve">The diagram below shows a plaque designed in the shape of an equilateral triangle sitting on top of a rectangle. The rectangle has height </w:t>
-      </w:r>
-      <m:oMath>
-        <m:r>
-          <m:t xml:space="preserve">p</m:t>
-        </m:r>
-      </m:oMath>
-      <w:r>
-        <w:t xml:space="preserve"> m and width </w:t>
-      </w:r>
-      <m:oMath>
-        <m:r>
-          <m:t xml:space="preserve">q</m:t>
-        </m:r>
-      </m:oMath>
-      <w:r>
-        <w:t xml:space="preserve"> m, and the equilateral triangle has side </w:t>
-      </w:r>
-      <m:oMath>
-        <m:r>
-          <m:t xml:space="preserve">q</m:t>
-        </m:r>
-      </m:oMath>
-      <w:r>
-        <w:t xml:space="preserve"> m.</w:t>
-      </w:r>
-    </w:p>
-    <w:p>
-      <w:pPr>
-        <w:spacing w:after="0"/>
-      </w:pPr>
-    </w:p>
-    <w:p>
-      <w:pPr>
-        <w:spacing w:after="0"/>
-        <w:jc w:val="center"/>
-      </w:pPr>
-      <w:r>
-        <w:drawing>
-          <wp:inline xmlns:a="http://schemas.openxmlformats.org/drawingml/2006/main" xmlns:pic="http://schemas.openxmlformats.org/drawingml/2006/picture">
-            <wp:extent cx="2015999" cy="2992045"/>
-            <wp:docPr id="1" name="Picture 1"/>
-            <wp:cNvGraphicFramePr>
-              <a:graphicFrameLocks noChangeAspect="1"/>
-            </wp:cNvGraphicFramePr>
-            <a:graphic>
-              <a:graphicData uri="http://schemas.openxmlformats.org/drawingml/2006/picture">
-                <pic:pic>
-                  <pic:nvPicPr>
-                    <pic:cNvPr id="0" name="plaque.png"/>
-                    <pic:cNvPicPr/>
-                  </pic:nvPicPr>
-                  <pic:blipFill>
-                    <a:blip r:embed="rId9"/>
-                    <a:stretch>
-                      <a:fillRect/>
-                    </a:stretch>
-                  </pic:blipFill>
-                  <pic:spPr>
-                    <a:xfrm>
-                      <a:off x="0" y="0"/>
-                      <a:ext cx="2015999" cy="2992045"/>
-                    </a:xfrm>
-                    <a:prstGeom prst="rect"/>
-                  </pic:spPr>
-                </pic:pic>
-              </a:graphicData>
-            </a:graphic>
-          </wp:inline>
-        </w:drawing>
-      </w:r>
-    </w:p>
-    <w:p>
-      <w:pPr>
-        <w:spacing w:after="0"/>
-      </w:pPr>
-    </w:p>
-    <w:p>
-      <w:pPr>
-        <w:tabs>
-          <w:tab w:pos="1474" w:val="left"/>
-          <w:tab w:pos="9071" w:val="right"/>
-        </w:tabs>
-        <w:spacing w:after="0"/>
-        <w:ind w:left="1474" w:hanging="624"/>
-      </w:pPr>
-      <w:r>
-        <w:rPr>
-          <w:b/>
-        </w:rPr>
-        <w:t>(i)</w:t>
-        <w:tab/>
-      </w:r>
-      <w:r>
-        <w:t xml:space="preserve">Given that the perimeter of the plaque is 10 m, express </w:t>
-      </w:r>
-      <m:oMath>
-        <m:r>
-          <m:t xml:space="preserve">p</m:t>
-        </m:r>
-      </m:oMath>
-      <w:r>
-        <w:t xml:space="preserve"> in terms of </w:t>
-      </w:r>
-      <m:oMath>
-        <m:r>
-          <m:t xml:space="preserve">q</m:t>
-        </m:r>
-      </m:oMath>
-      <w:r>
-        <w:t>.</w:t>
-      </w:r>
-      <w:r>
-        <w:tab/>
-        <w:t>[2]</w:t>
-      </w:r>
-    </w:p>
-    <w:p>
-      <w:pPr>
-        <w:spacing w:after="0"/>
-      </w:pPr>
-    </w:p>
-    <w:p>
-      <w:pPr>
-        <w:spacing w:after="0"/>
-      </w:pPr>
-    </w:p>
-    <w:p>
-      <w:pPr>
-        <w:spacing w:after="0"/>
-      </w:pPr>
-    </w:p>
-    <w:p>
-      <w:pPr>
-        <w:spacing w:after="0"/>
-      </w:pPr>
-    </w:p>
-    <w:p>
-      <w:pPr>
-        <w:spacing w:after="0"/>
-      </w:pPr>
-    </w:p>
-    <w:p>
-      <w:pPr>
-        <w:spacing w:after="0"/>
-      </w:pPr>
-    </w:p>
-    <w:p>
-      <w:pPr>
-        <w:spacing w:after="0"/>
-      </w:pPr>
-    </w:p>
-    <w:p>
-      <w:pPr>
-        <w:tabs>
-          <w:tab w:pos="1474" w:val="left"/>
-          <w:tab w:pos="9071" w:val="right"/>
-        </w:tabs>
-        <w:spacing w:after="0"/>
-        <w:ind w:left="1474" w:hanging="624"/>
-      </w:pPr>
-      <w:r>
-        <w:rPr>
-          <w:b/>
-        </w:rPr>
-        <w:t>(ii)</w:t>
-        <w:tab/>
-      </w:r>
-      <w:r>
-        <w:t xml:space="preserve">Show that the area of the plaque, </w:t>
-      </w:r>
-      <m:oMath>
-        <m:r>
-          <m:t xml:space="preserve">A</m:t>
-        </m:r>
-      </m:oMath>
-      <w:r>
-        <w:t xml:space="preserve"> m², is given by</w:t>
-      </w:r>
-      <w:r>
-        <w:tab/>
-        <w:t>[2]</w:t>
-      </w:r>
-    </w:p>
-    <w:p>
-      <w:pPr>
-        <w:spacing w:after="0"/>
-        <w:jc w:val="center"/>
-      </w:pPr>
-      <m:oMath>
-        <m:r>
-          <m:t xml:space="preserve">A</m:t>
-        </m:r>
-        <m:r>
-          <m:t xml:space="preserve"> = 5</m:t>
-        </m:r>
-        <m:r>
-          <m:t xml:space="preserve">q</m:t>
-        </m:r>
-        <m:r>
-          <m:t xml:space="preserve"> - </m:t>
-        </m:r>
-        <m:f>
-          <m:fPr>
-            <m:type m:val="bar"/>
-          </m:fPr>
-          <m:num>
-            <m:r>
-              <m:t xml:space="preserve">3</m:t>
-            </m:r>
-          </m:num>
-          <m:den>
-            <m:r>
-              <m:t xml:space="preserve">2</m:t>
-            </m:r>
-          </m:den>
-        </m:f>
-        <m:sSup>
-          <m:e>
-            <m:r>
-              <m:t xml:space="preserve">q</m:t>
-            </m:r>
-          </m:e>
-          <m:sup>
-            <m:r>
-              <m:t xml:space="preserve">2</m:t>
-            </m:r>
-          </m:sup>
-        </m:sSup>
-        <m:r>
-          <m:t xml:space="preserve"> + </m:t>
-        </m:r>
-        <m:f>
-          <m:fPr>
-            <m:type m:val="bar"/>
-          </m:fPr>
-          <m:num>
-            <m:rad>
-              <m:radPr>
-                <m:degHide m:val="1"/>
-              </m:radPr>
-              <m:deg/>
-              <m:e>
-                <m:r>
-                  <m:t xml:space="preserve">3</m:t>
-                </m:r>
-              </m:e>
-            </m:rad>
-          </m:num>
-          <m:den>
-            <m:r>
-              <m:t xml:space="preserve">4</m:t>
-            </m:r>
-          </m:den>
-        </m:f>
-        <m:sSup>
-          <m:e>
-            <m:r>
-              <m:t xml:space="preserve">q</m:t>
-            </m:r>
-          </m:e>
-          <m:sup>
-            <m:r>
-              <m:t xml:space="preserve">2</m:t>
-            </m:r>
-          </m:sup>
-        </m:sSup>
-      </m:oMath>
-    </w:p>
-    <w:p>
-      <w:r>
-        <w:br w:type="page"/>
-      </w:r>
-    </w:p>
-    <w:p>
-      <w:pPr>
-        <w:tabs>
-          <w:tab w:pos="850" w:val="left"/>
-          <w:tab w:pos="9071" w:val="right"/>
-        </w:tabs>
-        <w:spacing w:after="0"/>
-        <w:ind w:left="850" w:hanging="850"/>
-      </w:pPr>
-      <w:r>
-        <w:t>6</w:t>
-        <w:tab/>
-      </w:r>
-      <w:r>
         <w:t xml:space="preserve">Show that the line </w:t>
       </w:r>
       <m:oMath>
@@ -4128,7 +3840,7 @@
         <w:ind w:left="850" w:hanging="850"/>
       </w:pPr>
       <w:r>
-        <w:t>7</w:t>
+        <w:t>6</w:t>
         <w:tab/>
       </w:r>
       <w:r>
@@ -4243,6 +3955,340 @@
         <w:ind w:left="850" w:hanging="850"/>
       </w:pPr>
       <w:r>
+        <w:t>7</w:t>
+        <w:tab/>
+      </w:r>
+    </w:p>
+    <w:p>
+      <w:pPr>
+        <w:tabs>
+          <w:tab w:pos="1474" w:val="left"/>
+          <w:tab w:pos="9071" w:val="right"/>
+        </w:tabs>
+        <w:spacing w:after="0"/>
+        <w:ind w:left="1474" w:hanging="624"/>
+      </w:pPr>
+      <w:r>
+        <w:rPr>
+          <w:b/>
+        </w:rPr>
+        <w:t>(i)</w:t>
+        <w:tab/>
+      </w:r>
+      <w:r>
+        <w:t xml:space="preserve">Explain why </w:t>
+      </w:r>
+      <m:oMath>
+        <m:f>
+          <m:fPr>
+            <m:type m:val="bar"/>
+          </m:fPr>
+          <m:num>
+            <m:r>
+              <m:t xml:space="preserve">3</m:t>
+            </m:r>
+            <m:sSup>
+              <m:e>
+                <m:r>
+                  <m:t xml:space="preserve">x</m:t>
+                </m:r>
+              </m:e>
+              <m:sup>
+                <m:r>
+                  <m:t xml:space="preserve">2</m:t>
+                </m:r>
+              </m:sup>
+            </m:sSup>
+            <m:r>
+              <m:t xml:space="preserve"> + 3</m:t>
+            </m:r>
+            <m:r>
+              <m:t xml:space="preserve">x</m:t>
+            </m:r>
+            <m:r>
+              <m:t xml:space="preserve"> + 10</m:t>
+            </m:r>
+          </m:num>
+          <m:den>
+            <m:r>
+              <m:t xml:space="preserve">(</m:t>
+            </m:r>
+            <m:r>
+              <m:t xml:space="preserve">x</m:t>
+            </m:r>
+            <m:r>
+              <m:t xml:space="preserve"> + 1)(</m:t>
+            </m:r>
+            <m:sSup>
+              <m:e>
+                <m:r>
+                  <m:t xml:space="preserve">x</m:t>
+                </m:r>
+              </m:e>
+              <m:sup>
+                <m:r>
+                  <m:t xml:space="preserve">2</m:t>
+                </m:r>
+              </m:sup>
+            </m:sSup>
+            <m:r>
+              <m:t xml:space="preserve"> + 4)</m:t>
+            </m:r>
+          </m:den>
+        </m:f>
+      </m:oMath>
+      <w:r>
+        <w:t xml:space="preserve"> cannot be expressed in the form</w:t>
+      </w:r>
+      <w:r>
+        <w:tab/>
+        <w:t>[2]</w:t>
+      </w:r>
+    </w:p>
+    <w:p>
+      <w:pPr>
+        <w:spacing w:after="0"/>
+        <w:jc w:val="center"/>
+      </w:pPr>
+      <m:oMath>
+        <m:f>
+          <m:fPr>
+            <m:type m:val="bar"/>
+          </m:fPr>
+          <m:num>
+            <m:r>
+              <m:t xml:space="preserve">A</m:t>
+            </m:r>
+          </m:num>
+          <m:den>
+            <m:r>
+              <m:t xml:space="preserve">x</m:t>
+            </m:r>
+            <m:r>
+              <m:t xml:space="preserve"> + 1</m:t>
+            </m:r>
+          </m:den>
+        </m:f>
+        <m:r>
+          <m:t xml:space="preserve"> + </m:t>
+        </m:r>
+        <m:f>
+          <m:fPr>
+            <m:type m:val="bar"/>
+          </m:fPr>
+          <m:num>
+            <m:r>
+              <m:t xml:space="preserve">B</m:t>
+            </m:r>
+          </m:num>
+          <m:den>
+            <m:sSup>
+              <m:e>
+                <m:r>
+                  <m:t xml:space="preserve">x</m:t>
+                </m:r>
+              </m:e>
+              <m:sup>
+                <m:r>
+                  <m:t xml:space="preserve">2</m:t>
+                </m:r>
+              </m:sup>
+            </m:sSup>
+            <m:r>
+              <m:t xml:space="preserve"> + 4</m:t>
+            </m:r>
+          </m:den>
+        </m:f>
+        <m:r>
+          <m:t xml:space="preserve"> </m:t>
+        </m:r>
+        <m:r>
+          <m:rPr>
+            <m:nor/>
+            <m:sty m:val="p"/>
+          </m:rPr>
+          <m:t xml:space="preserve">, where </m:t>
+        </m:r>
+        <m:r>
+          <m:t xml:space="preserve"> </m:t>
+        </m:r>
+        <m:r>
+          <m:t xml:space="preserve">A</m:t>
+        </m:r>
+        <m:r>
+          <m:t xml:space="preserve"> </m:t>
+        </m:r>
+        <m:r>
+          <m:rPr>
+            <m:nor/>
+            <m:sty m:val="p"/>
+          </m:rPr>
+          <m:t xml:space="preserve"> and </m:t>
+        </m:r>
+        <m:r>
+          <m:t xml:space="preserve"> </m:t>
+        </m:r>
+        <m:r>
+          <m:t xml:space="preserve">B</m:t>
+        </m:r>
+        <m:r>
+          <m:t xml:space="preserve"> </m:t>
+        </m:r>
+        <m:r>
+          <m:rPr>
+            <m:nor/>
+            <m:sty m:val="p"/>
+          </m:rPr>
+          <m:t xml:space="preserve"> are constants.</m:t>
+        </m:r>
+      </m:oMath>
+    </w:p>
+    <w:p>
+      <w:pPr>
+        <w:spacing w:after="0"/>
+      </w:pPr>
+    </w:p>
+    <w:p>
+      <w:pPr>
+        <w:spacing w:after="0"/>
+      </w:pPr>
+    </w:p>
+    <w:p>
+      <w:pPr>
+        <w:spacing w:after="0"/>
+      </w:pPr>
+    </w:p>
+    <w:p>
+      <w:pPr>
+        <w:spacing w:after="0"/>
+      </w:pPr>
+    </w:p>
+    <w:p>
+      <w:pPr>
+        <w:spacing w:after="0"/>
+      </w:pPr>
+    </w:p>
+    <w:p>
+      <w:pPr>
+        <w:spacing w:after="0"/>
+      </w:pPr>
+    </w:p>
+    <w:p>
+      <w:pPr>
+        <w:spacing w:after="0"/>
+      </w:pPr>
+    </w:p>
+    <w:p>
+      <w:pPr>
+        <w:spacing w:after="0"/>
+      </w:pPr>
+    </w:p>
+    <w:p>
+      <w:pPr>
+        <w:spacing w:after="0"/>
+      </w:pPr>
+    </w:p>
+    <w:p>
+      <w:pPr>
+        <w:tabs>
+          <w:tab w:pos="1474" w:val="left"/>
+          <w:tab w:pos="9071" w:val="right"/>
+        </w:tabs>
+        <w:spacing w:after="0"/>
+        <w:ind w:left="1474" w:hanging="624"/>
+      </w:pPr>
+      <w:r>
+        <w:rPr>
+          <w:b/>
+        </w:rPr>
+        <w:t>(ii)</w:t>
+        <w:tab/>
+      </w:r>
+      <w:r>
+        <w:t xml:space="preserve">Express </w:t>
+      </w:r>
+      <m:oMath>
+        <m:f>
+          <m:fPr>
+            <m:type m:val="bar"/>
+          </m:fPr>
+          <m:num>
+            <m:r>
+              <m:t xml:space="preserve">3</m:t>
+            </m:r>
+            <m:sSup>
+              <m:e>
+                <m:r>
+                  <m:t xml:space="preserve">x</m:t>
+                </m:r>
+              </m:e>
+              <m:sup>
+                <m:r>
+                  <m:t xml:space="preserve">2</m:t>
+                </m:r>
+              </m:sup>
+            </m:sSup>
+            <m:r>
+              <m:t xml:space="preserve"> + 3</m:t>
+            </m:r>
+            <m:r>
+              <m:t xml:space="preserve">x</m:t>
+            </m:r>
+            <m:r>
+              <m:t xml:space="preserve"> + 10</m:t>
+            </m:r>
+          </m:num>
+          <m:den>
+            <m:r>
+              <m:t xml:space="preserve">(</m:t>
+            </m:r>
+            <m:r>
+              <m:t xml:space="preserve">x</m:t>
+            </m:r>
+            <m:r>
+              <m:t xml:space="preserve"> + 1)(</m:t>
+            </m:r>
+            <m:sSup>
+              <m:e>
+                <m:r>
+                  <m:t xml:space="preserve">x</m:t>
+                </m:r>
+              </m:e>
+              <m:sup>
+                <m:r>
+                  <m:t xml:space="preserve">2</m:t>
+                </m:r>
+              </m:sup>
+            </m:sSup>
+            <m:r>
+              <m:t xml:space="preserve"> + 4)</m:t>
+            </m:r>
+          </m:den>
+        </m:f>
+      </m:oMath>
+      <w:r>
+        <w:t xml:space="preserve"> in partial fractions.</w:t>
+      </w:r>
+      <w:r>
+        <w:tab/>
+        <w:t>[4]</w:t>
+      </w:r>
+    </w:p>
+    <w:p>
+      <w:r>
+        <w:br w:type="page"/>
+      </w:r>
+    </w:p>
+    <w:p>
+      <w:pPr>
+        <w:tabs>
+          <w:tab w:pos="850" w:val="left"/>
+          <w:tab w:pos="9071" w:val="right"/>
+        </w:tabs>
+        <w:spacing w:after="0"/>
+        <w:ind w:left="850" w:hanging="850"/>
+      </w:pPr>
+      <w:r>
         <w:t>8</w:t>
         <w:tab/>
       </w:r>
@@ -4874,7 +4920,7 @@
         <w:drawing>
           <wp:inline xmlns:a="http://schemas.openxmlformats.org/drawingml/2006/main" xmlns:pic="http://schemas.openxmlformats.org/drawingml/2006/picture">
             <wp:extent cx="4860000" cy="3181665"/>
-            <wp:docPr id="2" name="Picture 2"/>
+            <wp:docPr id="1" name="Picture 1"/>
             <wp:cNvGraphicFramePr>
               <a:graphicFrameLocks noChangeAspect="1"/>
             </wp:cNvGraphicFramePr>
@@ -4886,7 +4932,7 @@
                     <pic:cNvPicPr/>
                   </pic:nvPicPr>
                   <pic:blipFill>
-                    <a:blip r:embed="rId10"/>
+                    <a:blip r:embed="rId9"/>
                     <a:stretch>
                       <a:fillRect/>
                     </a:stretch>
@@ -6200,7 +6246,7 @@
         <w:drawing>
           <wp:inline xmlns:a="http://schemas.openxmlformats.org/drawingml/2006/main" xmlns:pic="http://schemas.openxmlformats.org/drawingml/2006/picture">
             <wp:extent cx="5220000" cy="6763851"/>
-            <wp:docPr id="3" name="Picture 3"/>
+            <wp:docPr id="2" name="Picture 2"/>
             <wp:cNvGraphicFramePr>
               <a:graphicFrameLocks noChangeAspect="1"/>
             </wp:cNvGraphicFramePr>
@@ -6212,7 +6258,7 @@
                     <pic:cNvPicPr/>
                   </pic:nvPicPr>
                   <pic:blipFill>
-                    <a:blip r:embed="rId11"/>
+                    <a:blip r:embed="rId10"/>
                     <a:stretch>
                       <a:fillRect/>
                     </a:stretch>
@@ -6274,70 +6320,6 @@
       <w:r>
         <w:tab/>
         <w:t>[4]</w:t>
-      </w:r>
-    </w:p>
-    <w:p>
-      <w:pPr>
-        <w:spacing w:after="0"/>
-      </w:pPr>
-    </w:p>
-    <w:p>
-      <w:pPr>
-        <w:spacing w:after="0"/>
-      </w:pPr>
-    </w:p>
-    <w:p>
-      <w:pPr>
-        <w:spacing w:after="0"/>
-      </w:pPr>
-    </w:p>
-    <w:p>
-      <w:pPr>
-        <w:spacing w:after="0"/>
-      </w:pPr>
-    </w:p>
-    <w:p>
-      <w:pPr>
-        <w:spacing w:after="0"/>
-      </w:pPr>
-    </w:p>
-    <w:p>
-      <w:pPr>
-        <w:spacing w:after="0"/>
-      </w:pPr>
-    </w:p>
-    <w:p>
-      <w:pPr>
-        <w:spacing w:after="0"/>
-      </w:pPr>
-    </w:p>
-    <w:p>
-      <w:pPr>
-        <w:spacing w:after="0"/>
-      </w:pPr>
-    </w:p>
-    <w:p>
-      <w:pPr>
-        <w:tabs>
-          <w:tab w:pos="1474" w:val="left"/>
-          <w:tab w:pos="9071" w:val="right"/>
-        </w:tabs>
-        <w:spacing w:after="0"/>
-        <w:ind w:left="1474" w:hanging="624"/>
-      </w:pPr>
-      <w:r>
-        <w:rPr>
-          <w:b/>
-        </w:rPr>
-        <w:t>(c)</w:t>
-        <w:tab/>
-      </w:r>
-      <w:r>
-        <w:t>Use your graph to estimate the distance from the buoy when the signal loss is 30 dB. Leave your answer to the nearest metre.</w:t>
-      </w:r>
-      <w:r>
-        <w:tab/>
-        <w:t>[2]</w:t>
       </w:r>
     </w:p>
     <w:p>

</xml_diff>